<commit_message>
Add abstract/appendices, streamlit test samples, DDI testing manual; consolidate clutter into gitignored trash/
Renames the misc/ clutter folder to trash/ and sweeps in remaining
non-source stragglers (handbook docx, demo pdf, one-off verify scripts,
stray logs) so the tracked tree only holds source and dissertation content.

Co-Authored-By: Claude Sonnet 5 <noreply@anthropic.com>
Claude-Session: https://claude.ai/code/session_019qFqEjAzX8UaG3UVRWWh5f
</commit_message>
<xml_diff>
--- a/writing/references.docx
+++ b/writing/references.docx
@@ -9,7 +9,8 @@
       <w:r>
         <w:rPr>
           <w:rFonts w:ascii="Times New Roman" w:hAnsi="Times New Roman"/>
-          <w:sz w:val="22"/>
+          <w:color w:val="000000"/>
+          <w:sz w:val="24"/>
         </w:rPr>
         <w:t>References</w:t>
       </w:r>
@@ -36,7 +37,7 @@
       <w:r>
         <w:rPr>
           <w:rFonts w:ascii="Times New Roman" w:hAnsi="Times New Roman"/>
-          <w:sz w:val="22"/>
+          <w:sz w:val="24"/>
         </w:rPr>
         <w:t>Aburaed, N., Panthakkan, A., Al-Saad, M., Amin, S.A., Mansoor, W., 2020. Deep Convolutional Neural Network (DCNN) for Skin Cancer Classification, in: 2020 27th IEEE International Conference on Electronics, Circuits and Systems (ICECS). Presented at the 2020 27th IEEE International Conference on Electronics, Circuits and Systems (ICECS), IEEE, Glasgow, UK, pp. 1 to 4. https://doi.org/10.1109/ICECS49266.2020.9294814</w:t>
       </w:r>
@@ -49,7 +50,7 @@
       <w:r>
         <w:rPr>
           <w:rFonts w:ascii="Times New Roman" w:hAnsi="Times New Roman"/>
-          <w:sz w:val="22"/>
+          <w:sz w:val="24"/>
         </w:rPr>
         <w:t>Adadi, A., Berrada, M., 2018. Peeking Inside the Black-Box: A Survey on Explainable Artificial Intelligence (XAI). IEEE Access 6, 52138 to 52160. https://doi.org/10.1109/ACCESS.2018.2870052</w:t>
       </w:r>
@@ -62,7 +63,7 @@
       <w:r>
         <w:rPr>
           <w:rFonts w:ascii="Times New Roman" w:hAnsi="Times New Roman"/>
-          <w:sz w:val="22"/>
+          <w:sz w:val="24"/>
         </w:rPr>
         <w:t>Civelek, Z., Kfashi, M., 2022. An Improved Deep CNN For an Early and Accurate Skin Cancer Detection and Diagnosis System. Uluslararasi Muhendislik Arastirma ve Gelistirme Dergisi 14, 721 to 734. https://doi.org/10.29137/umagd.1116295</w:t>
       </w:r>
@@ -89,7 +90,7 @@
       <w:r>
         <w:rPr>
           <w:rFonts w:ascii="Times New Roman" w:hAnsi="Times New Roman"/>
-          <w:sz w:val="22"/>
+          <w:sz w:val="24"/>
         </w:rPr>
         <w:t>Codella, N., Rotemberg, V., Tschandl, P., Celebi, M.E., Dusza, S., Gutman, D., Helba, B., Kalloo, A., Liopyris, K., Marchetti, M., Kittler, H., Halpern, A., 2019. Skin Lesion Analysis Toward Melanoma Detection 2018: A Challenge Hosted by the International Skin Imaging Collaboration (ISIC). https://doi.org/10.48550/arXiv.1902.03368</w:t>
       </w:r>
@@ -102,7 +103,7 @@
       <w:r>
         <w:rPr>
           <w:rFonts w:ascii="Times New Roman" w:hAnsi="Times New Roman"/>
-          <w:sz w:val="22"/>
+          <w:sz w:val="24"/>
         </w:rPr>
         <w:t>Daneshjou, R., Vodrahalli, K., Novoa, R.A., Jenkins, M., Liang, W., Rotemberg, V., Ko, J., Swetter, S.M., Bailey, E.E., Gevaert, O., Mukherjee, P., Phung, M., Yekrang, K., Fong, B., Sahasrabudhe, R., Zou, J., Chiou, A.S., 2022. Disparities in dermatology AI performance on a diverse, curated clinical image set. Science Advances 8, eabq6147. https://doi.org/10.1126/sciadv.abq6147</w:t>
       </w:r>
@@ -129,7 +130,7 @@
       <w:r>
         <w:rPr>
           <w:rFonts w:ascii="Times New Roman" w:hAnsi="Times New Roman"/>
-          <w:sz w:val="22"/>
+          <w:sz w:val="24"/>
         </w:rPr>
         <w:t>Esteva, A., Kuprel, B., Novoa, R.A., Ko, J., Swetter, S.M., Blau, H.M., Thrun, S., 2017. Dermatologist-level classification of skin cancer with deep neural networks. Nature 542, 115 to 118. https://doi.org/10.1038/nature21056</w:t>
       </w:r>
@@ -156,7 +157,7 @@
       <w:r>
         <w:rPr>
           <w:rFonts w:ascii="Times New Roman" w:hAnsi="Times New Roman"/>
-          <w:sz w:val="22"/>
+          <w:sz w:val="24"/>
         </w:rPr>
         <w:t>Goodfellow, I., Bengio, Y., Courville, A., 2016. Deep Learning. MIT Press, Cambridge, MA.</w:t>
       </w:r>
@@ -183,7 +184,7 @@
       <w:r>
         <w:rPr>
           <w:rFonts w:ascii="Times New Roman" w:hAnsi="Times New Roman"/>
-          <w:sz w:val="22"/>
+          <w:sz w:val="24"/>
         </w:rPr>
         <w:t>Haenssle, H.A., Fink, C., Schneiderbauer, R., Toberer, F., Buhl, T., Blum, A., Kalloo, A., Hassen, A.B.H., Thomas, L., Enk, A., Uhlmann, L., et al., 2018. Man against machine: diagnostic performance of a deep learning convolutional neural network for dermoscopic melanoma recognition in comparison to 58 dermatologists. Annals of Oncology 29, 1836 to 1842. https://doi.org/10.1093/annonc/mdy166</w:t>
       </w:r>
@@ -210,7 +211,7 @@
       <w:r>
         <w:rPr>
           <w:rFonts w:ascii="Times New Roman" w:hAnsi="Times New Roman"/>
-          <w:sz w:val="22"/>
+          <w:sz w:val="24"/>
         </w:rPr>
         <w:t>Hauser, K., Kurz, A., Haggenmuller, S., Maron, R.C., Von Kalle, C., Utikal, J.S., Meier, F., Hobelsberger, S., Gellrich, F.F., Sergon, M., Hauschild, A., French, L.E., Heinzerling, L., Schlager, J.G., Ghoreschi, K., Schlaak, M., Hilke, F.J., Poch, G., Kutzner, H., Berking, C., Heppt, M.V., Erdmann, M., Haferkamp, S., Schadendorf, D., Sondermann, W., Goebeler, M., Schilling, B., Kather, J.N., Frohling, S., Lipka, D.B., Hekler, A., Krieghoff-Henning, E., Brinker, T.J., 2022. Explainable artificial intelligence in skin cancer recognition: A systematic review. European Journal of Cancer 167, 54 to 69. https://doi.org/10.1016/j.ejca.2022.02.025</w:t>
       </w:r>
@@ -223,7 +224,7 @@
       <w:r>
         <w:rPr>
           <w:rFonts w:ascii="Times New Roman" w:hAnsi="Times New Roman"/>
-          <w:sz w:val="22"/>
+          <w:sz w:val="24"/>
         </w:rPr>
         <w:t>He, K., Zhang, X., Ren, S., Sun, J., 2016. Deep Residual Learning for Image Recognition, in: 2016 IEEE Conference on Computer Vision and Pattern Recognition (CVPR). IEEE, Las Vegas, NV, pp. 770 to 778. https://doi.org/10.1109/CVPR.2016.90</w:t>
       </w:r>
@@ -250,7 +251,7 @@
       <w:r>
         <w:rPr>
           <w:rFonts w:ascii="Times New Roman" w:hAnsi="Times New Roman"/>
-          <w:sz w:val="22"/>
+          <w:sz w:val="24"/>
         </w:rPr>
         <w:t>Liu, R., Chen, Z., Yao, G., Zhang, P., 2026. Exploring the challenge and value of deep learning in automated skin disease diagnosis. Biomedical Signal Processing and Control 117, 109589. https://doi.org/10.1016/j.bspc.2026.109589</w:t>
       </w:r>
@@ -263,7 +264,7 @@
       <w:r>
         <w:rPr>
           <w:rFonts w:ascii="Times New Roman" w:hAnsi="Times New Roman"/>
-          <w:sz w:val="22"/>
+          <w:sz w:val="24"/>
         </w:rPr>
         <w:t>Lundberg, S.M., Lee, S.-I., 2017. A Unified Approach to Interpreting Model Predictions, in: Advances in Neural Information Processing Systems 30 (NeurIPS 2017). Curran Associates, Inc., pp. 4765 to 4774.</w:t>
       </w:r>
@@ -290,7 +291,7 @@
       <w:r>
         <w:rPr>
           <w:rFonts w:ascii="Times New Roman" w:hAnsi="Times New Roman"/>
-          <w:sz w:val="22"/>
+          <w:sz w:val="24"/>
         </w:rPr>
         <w:t>Mahmud, A., 2024. Evaluation of Deep Learning Models for the Detection of Skin Cancer with Dermatoscopic Images.</w:t>
       </w:r>
@@ -317,7 +318,7 @@
       <w:r>
         <w:rPr>
           <w:rFonts w:ascii="Times New Roman" w:hAnsi="Times New Roman"/>
-          <w:sz w:val="22"/>
+          <w:sz w:val="24"/>
         </w:rPr>
         <w:t>Selvaraju, R.R., Cogswell, M., Das, A., Vedantam, R., Parikh, D., Batra, D., 2017. Grad-CAM: Visual Explanations from Deep Networks via Gradient-Based Localization, in: 2017 IEEE International Conference on Computer Vision (ICCV). IEEE, Venice, pp. 618 to 626. https://doi.org/10.1109/ICCV.2017.74</w:t>
       </w:r>
@@ -344,7 +345,7 @@
       <w:r>
         <w:rPr>
           <w:rFonts w:ascii="Times New Roman" w:hAnsi="Times New Roman"/>
-          <w:sz w:val="22"/>
+          <w:sz w:val="24"/>
         </w:rPr>
         <w:t>Simonyan, K., Zisserman, A., 2014. Very Deep Convolutional Networks for Large-Scale Image Recognition. arXiv:1409.1556.</w:t>
       </w:r>
@@ -371,7 +372,7 @@
       <w:r>
         <w:rPr>
           <w:rFonts w:ascii="Times New Roman" w:hAnsi="Times New Roman"/>
-          <w:sz w:val="22"/>
+          <w:sz w:val="24"/>
         </w:rPr>
         <w:t>Tahir, M., Naeem, A., Malik, H., Tanveer, J., Naqvi, R.A., Lee, S.-W., 2023. DSCC_Net: Multi-Classification Deep Learning Models for Diagnosing of Skin Cancer Using Dermoscopic Images. Cancers 15, 2179. https://doi.org/10.3390/cancers15072179</w:t>
       </w:r>
@@ -384,7 +385,7 @@
       <w:r>
         <w:rPr>
           <w:rFonts w:ascii="Times New Roman" w:hAnsi="Times New Roman"/>
-          <w:sz w:val="22"/>
+          <w:sz w:val="24"/>
         </w:rPr>
         <w:t>Tan, M., Le, Q.V., 2019. EfficientNet: Rethinking Model Scaling for Convolutional Neural Networks, in: Proceedings of the 36th International Conference on Machine Learning (ICML 2019). PMLR, pp. 6105 to 6114.</w:t>
       </w:r>
@@ -411,7 +412,7 @@
       <w:r>
         <w:rPr>
           <w:rFonts w:ascii="Times New Roman" w:hAnsi="Times New Roman"/>
-          <w:sz w:val="22"/>
+          <w:sz w:val="24"/>
         </w:rPr>
         <w:t>Tschandl, P., Rosendahl, C., Kittler, H., 2018. The HAM10000 dataset, a large collection of multi-source dermatoscopic images of common pigmented skin lesions. Scientific Data 5, 180161. https://doi.org/10.1038/sdata.2018.161</w:t>
       </w:r>
@@ -808,7 +809,7 @@
     </w:pPr>
     <w:rPr>
       <w:rFonts w:ascii="Times New Roman" w:hAnsi="Times New Roman" w:eastAsia="Times New Roman"/>
-      <w:sz w:val="22"/>
+      <w:sz w:val="24"/>
     </w:rPr>
   </w:style>
   <w:style w:type="paragraph" w:styleId="Header">
@@ -873,6 +874,7 @@
       <w:rFonts w:asciiTheme="majorHAnsi" w:eastAsiaTheme="majorEastAsia" w:hAnsiTheme="majorHAnsi" w:cstheme="majorBidi" w:ascii="Times New Roman" w:hAnsi="Times New Roman"/>
       <w:b/>
       <w:bCs/>
+      <w:color w:val="000000"/>
       <w:sz w:val="36"/>
       <w:szCs w:val="28"/>
     </w:rPr>
@@ -896,6 +898,7 @@
       <w:rFonts w:asciiTheme="majorHAnsi" w:eastAsiaTheme="majorEastAsia" w:hAnsiTheme="majorHAnsi" w:cstheme="majorBidi" w:ascii="Times New Roman" w:hAnsi="Times New Roman"/>
       <w:b/>
       <w:bCs/>
+      <w:color w:val="000000"/>
       <w:sz w:val="30"/>
       <w:szCs w:val="26"/>
     </w:rPr>
@@ -919,6 +922,7 @@
       <w:rFonts w:asciiTheme="majorHAnsi" w:eastAsiaTheme="majorEastAsia" w:hAnsiTheme="majorHAnsi" w:cstheme="majorBidi" w:ascii="Times New Roman" w:hAnsi="Times New Roman"/>
       <w:b/>
       <w:bCs/>
+      <w:color w:val="000000"/>
       <w:sz w:val="26"/>
     </w:rPr>
   </w:style>
@@ -935,16 +939,17 @@
     <w:pPr>
       <w:keepNext/>
       <w:keepLines/>
-      <w:spacing w:before="200" w:after="0"/>
+      <w:spacing w:before="280" w:after="120" w:line="360" w:lineRule="auto"/>
       <w:outlineLvl w:val="3"/>
     </w:pPr>
     <w:rPr>
-      <w:rFonts w:asciiTheme="majorHAnsi" w:eastAsiaTheme="majorEastAsia" w:hAnsiTheme="majorHAnsi" w:cstheme="majorBidi"/>
+      <w:rFonts w:asciiTheme="majorHAnsi" w:eastAsiaTheme="majorEastAsia" w:hAnsiTheme="majorHAnsi" w:cstheme="majorBidi" w:ascii="Times New Roman" w:hAnsi="Times New Roman"/>
       <w:b/>
       <w:bCs/>
       <w:i/>
       <w:iCs/>
-      <w:color w:val="4F81BD" w:themeColor="accent1"/>
+      <w:color w:val="000000"/>
+      <w:sz w:val="25"/>
     </w:rPr>
   </w:style>
   <w:style w:type="paragraph" w:styleId="Heading5">

</xml_diff>